<commit_message>
Word dei comunicati con il logo orizzontale con motto
Co-Authored-By: Claude Opus 5.5 <noreply@anthropic.com>
Claude-Session: https://claude.ai/code/session_01EgFUh35YFLvwYchX5gGEF1
</commit_message>
<xml_diff>
--- a/notizie/il-cinema-di-chi-ha-gia-capito-tutto/itaisral-2026-10-29-il-cinema-di-chi-ha-gia-capito-tutto.docx
+++ b/notizie/il-cinema-di-chi-ha-gia-capito-tutto/itaisral-2026-10-29-il-cinema-di-chi-ha-gia-capito-tutto.docx
@@ -3,6 +3,9 @@
 <w:document xmlns:wpc="http://schemas.microsoft.com/office/word/2010/wordprocessingCanvas" xmlns:mo="http://schemas.microsoft.com/office/mac/office/2008/main" xmlns:mc="http://schemas.openxmlformats.org/markup-compatibility/2006" xmlns:mv="urn:schemas-microsoft-com:mac:vml" xmlns:o="urn:schemas-microsoft-com:office:office" xmlns:r="http://schemas.openxmlformats.org/officeDocument/2006/relationships" xmlns:m="http://schemas.openxmlformats.org/officeDocument/2006/math" xmlns:v="urn:schemas-microsoft-com:vml" xmlns:wp14="http://schemas.microsoft.com/office/word/2010/wordprocessingDrawing" xmlns:wp="http://schemas.openxmlformats.org/drawingml/2006/wordprocessingDrawing" xmlns:w10="urn:schemas-microsoft-com:office:word" xmlns:w="http://schemas.openxmlformats.org/wordprocessingml/2006/main" xmlns:w14="http://schemas.microsoft.com/office/word/2010/wordml" xmlns:wpg="http://schemas.microsoft.com/office/word/2010/wordprocessingGroup" xmlns:wpi="http://schemas.microsoft.com/office/word/2010/wordprocessingInk" xmlns:wne="http://schemas.microsoft.com/office/word/2006/wordml" xmlns:wps="http://schemas.microsoft.com/office/word/2010/wordprocessingShape" mc:Ignorable="w14 wp14">
   <w:body>
     <w:p>
+      <w:pPr>
+        <w:spacing w:before="200"/>
+      </w:pPr>
       <w:r>
         <w:rPr>
           <w:b/>
@@ -199,7 +202,7 @@
     <w:r>
       <w:drawing>
         <wp:inline xmlns:a="http://schemas.openxmlformats.org/drawingml/2006/main" xmlns:pic="http://schemas.openxmlformats.org/drawingml/2006/picture">
-          <wp:extent cx="540000" cy="540810"/>
+          <wp:extent cx="2520000" cy="889200"/>
           <wp:docPr id="1" name="Picture 1"/>
           <wp:cNvGraphicFramePr>
             <a:graphicFrameLocks noChangeAspect="1"/>
@@ -208,7 +211,7 @@
             <a:graphicData uri="http://schemas.openxmlformats.org/drawingml/2006/picture">
               <pic:pic>
                 <pic:nvPicPr>
-                  <pic:cNvPr id="0" name="itaisral-logo.png"/>
+                  <pic:cNvPr id="0" name="_logo-word.png"/>
                   <pic:cNvPicPr/>
                 </pic:nvPicPr>
                 <pic:blipFill>
@@ -220,7 +223,7 @@
                 <pic:spPr>
                   <a:xfrm>
                     <a:off x="0" y="0"/>
-                    <a:ext cx="540000" cy="540810"/>
+                    <a:ext cx="2520000" cy="889200"/>
                   </a:xfrm>
                   <a:prstGeom prst="rect"/>
                 </pic:spPr>
@@ -229,16 +232,6 @@
           </a:graphic>
         </wp:inline>
       </w:drawing>
-    </w:r>
-    <w:r>
-      <w:t xml:space="preserve">   </w:t>
-    </w:r>
-    <w:r>
-      <w:rPr>
-        <w:color w:val="18304E"/>
-        <w:sz w:val="20"/>
-      </w:rPr>
-      <w:t>Associazione Italia Israele • Alessandria</w:t>
     </w:r>
   </w:p>
 </w:hdr>

</xml_diff>

<commit_message>
Il cinema di chi ha già capito tutto: comunicato allineato alla versione inviata
Co-Authored-By: Claude Opus 5.5 <noreply@anthropic.com>
Claude-Session: https://claude.ai/code/session_01EgFUh35YFLvwYchX5gGEF1
</commit_message>
<xml_diff>
--- a/notizie/il-cinema-di-chi-ha-gia-capito-tutto/itaisral-2026-10-29-il-cinema-di-chi-ha-gia-capito-tutto.docx
+++ b/notizie/il-cinema-di-chi-ha-gia-capito-tutto/itaisral-2026-10-29-il-cinema-di-chi-ha-gia-capito-tutto.docx
@@ -80,7 +80,7 @@
           <w:b w:val="0"/>
           <w:i w:val="0"/>
         </w:rPr>
-        <w:t>La definizione di Israele come «stato terrorista-sionista» e l’accusa di genocidio, sono sinonimi di demonizzazione di un intero Stato e del suo popolo, con l’aggravante di farlo dentro una rassegna che si presenta come luogo di cultura e di confronto.</w:t>
+        <w:t>La definizione di Israele come «stato terrorista-sionista» e l’accusa di genocidio sono sinonimi di demonizzazione di un intero Stato e del suo popolo, con l’aggravante di farlo dentro una rassegna che si presenta come luogo di cultura e di confronto.</w:t>
       </w:r>
     </w:p>
     <w:p>
@@ -92,7 +92,7 @@
           <w:b w:val="0"/>
           <w:i w:val="0"/>
         </w:rPr>
-        <w:t>Respingiamo con forza l’accusa di Stato terrorista e l’accusa di genocidio. La seconda è una fattispecie giuridica precisa, che richiede l’intento specifico di distruggere un gruppo protetto in quanto tale, e non può essere presentata al pubblico come un fatto già accertato.</w:t>
+        <w:t>Respingiamo con forza queste accuse. Quella di genocidio, inoltre, è una fattispecie giuridica precisa, che richiede l’intento specifico di distruggere un gruppo protetto in quanto tale, e non può essere presentata al pubblico come un fatto già accertato.</w:t>
       </w:r>
     </w:p>
     <w:p>

</xml_diff>